<commit_message>
Fill report cover with student name and ID
</commit_message>
<xml_diff>
--- a/docs/report.docx
+++ b/docs/report.docx
@@ -217,7 +217,7 @@
               <w:rPr>
                 <w:sz w:val="28"/>
               </w:rPr>
-              <w:t>________________</w:t>
+              <w:t>杨斯源</w:t>
             </w:r>
           </w:p>
         </w:tc>
@@ -264,89 +264,7 @@
               <w:rPr>
                 <w:sz w:val="28"/>
               </w:rPr>
-              <w:t>________________</w:t>
-            </w:r>
-          </w:p>
-        </w:tc>
-      </w:tr>
-      <w:tr>
-        <w:trPr>
-          <w:trHeight w:val="539"/>
-          <w:jc w:val="center"/>
-        </w:trPr>
-        <w:tc>
-          <w:tcPr>
-            <w:tcW w:w="1928" w:type="dxa"/>
-          </w:tcPr>
-          <w:p>
-            <w:pPr>
-              <w:jc w:val="right"/>
-            </w:pPr>
-            <w:r>
-              <w:rPr>
-                <w:sz w:val="28"/>
-              </w:rPr>
-              <w:t>班</w:t>
-            </w:r>
-            <w:r>
-              <w:rPr>
-                <w:sz w:val="28"/>
-              </w:rPr>
-              <w:t xml:space="preserve">    </w:t>
-            </w:r>
-            <w:r>
-              <w:rPr>
-                <w:sz w:val="28"/>
-              </w:rPr>
-              <w:t>级</w:t>
-            </w:r>
-          </w:p>
-        </w:tc>
-        <w:tc>
-          <w:tcPr>
-            <w:tcW w:w="4422" w:type="dxa"/>
-          </w:tcPr>
-          <w:p>
-            <w:r>
-              <w:rPr>
-                <w:sz w:val="28"/>
-              </w:rPr>
-              <w:t>________________</w:t>
-            </w:r>
-          </w:p>
-        </w:tc>
-      </w:tr>
-      <w:tr>
-        <w:trPr>
-          <w:trHeight w:val="539"/>
-          <w:jc w:val="center"/>
-        </w:trPr>
-        <w:tc>
-          <w:tcPr>
-            <w:tcW w:w="1928" w:type="dxa"/>
-          </w:tcPr>
-          <w:p>
-            <w:pPr>
-              <w:jc w:val="right"/>
-            </w:pPr>
-            <w:r>
-              <w:rPr>
-                <w:sz w:val="28"/>
-              </w:rPr>
-              <w:t>指导教师</w:t>
-            </w:r>
-          </w:p>
-        </w:tc>
-        <w:tc>
-          <w:tcPr>
-            <w:tcW w:w="4422" w:type="dxa"/>
-          </w:tcPr>
-          <w:p>
-            <w:r>
-              <w:rPr>
-                <w:sz w:val="28"/>
-              </w:rPr>
-              <w:t>________________</w:t>
+              <w:t>2412796</w:t>
             </w:r>
           </w:p>
         </w:tc>
@@ -485,7 +403,7 @@
         <w:spacing w:before="0" w:after="200"/>
         <w:jc w:val="center"/>
       </w:pPr>
-      <w:bookmarkStart w:id="0" w:name="_Toc244112086"/>
+      <w:bookmarkStart w:id="0" w:name="_Toc244293911"/>
       <w:r>
         <w:rPr>
           <w:rFonts w:ascii="黑体" w:eastAsia="黑体" w:hAnsi="黑体"/>
@@ -854,7 +772,7 @@
         </w:rPr>
         <w:fldChar w:fldCharType="separate"/>
       </w:r>
-      <w:hyperlink w:anchor="_Toc244112086" w:history="1">
+      <w:hyperlink w:anchor="_Toc244293911" w:history="1">
         <w:r>
           <w:rPr>
             <w:rStyle w:val="aff9"/>
@@ -897,7 +815,7 @@
             <w:webHidden/>
             <w:sz w:val="20"/>
           </w:rPr>
-          <w:instrText>PAGEREF _Toc244112086 \h</w:instrText>
+          <w:instrText>PAGEREF _Toc244293911 \h</w:instrText>
         </w:r>
         <w:r>
           <w:rPr>
@@ -962,7 +880,7 @@
           <w14:ligatures w14:val="standardContextual"/>
         </w:rPr>
       </w:pPr>
-      <w:hyperlink w:anchor="_Toc244112087" w:history="1">
+      <w:hyperlink w:anchor="_Toc244293912" w:history="1">
         <w:r>
           <w:rPr>
             <w:rStyle w:val="aff9"/>
@@ -1012,7 +930,7 @@
             <w:webHidden/>
             <w:sz w:val="20"/>
           </w:rPr>
-          <w:instrText>PAGEREF _Toc244112087 \h</w:instrText>
+          <w:instrText>PAGEREF _Toc244293912 \h</w:instrText>
         </w:r>
         <w:r>
           <w:rPr>
@@ -1077,7 +995,7 @@
           <w14:ligatures w14:val="standardContextual"/>
         </w:rPr>
       </w:pPr>
-      <w:hyperlink w:anchor="_Toc244112088" w:history="1">
+      <w:hyperlink w:anchor="_Toc244293913" w:history="1">
         <w:r>
           <w:rPr>
             <w:rStyle w:val="aff9"/>
@@ -1127,7 +1045,7 @@
             <w:webHidden/>
             <w:sz w:val="20"/>
           </w:rPr>
-          <w:instrText>PAGEREF _Toc244112088 \h</w:instrText>
+          <w:instrText>PAGEREF _Toc244293913 \h</w:instrText>
         </w:r>
         <w:r>
           <w:rPr>
@@ -1192,7 +1110,7 @@
           <w14:ligatures w14:val="standardContextual"/>
         </w:rPr>
       </w:pPr>
-      <w:hyperlink w:anchor="_Toc244112089" w:history="1">
+      <w:hyperlink w:anchor="_Toc244293914" w:history="1">
         <w:r>
           <w:rPr>
             <w:rStyle w:val="aff9"/>
@@ -1242,7 +1160,7 @@
             <w:webHidden/>
             <w:sz w:val="20"/>
           </w:rPr>
-          <w:instrText>PAGEREF _Toc244112089 \h</w:instrText>
+          <w:instrText>PAGEREF _Toc244293914 \h</w:instrText>
         </w:r>
         <w:r>
           <w:rPr>
@@ -1308,7 +1226,7 @@
           <w14:ligatures w14:val="standardContextual"/>
         </w:rPr>
       </w:pPr>
-      <w:hyperlink w:anchor="_Toc244112090" w:history="1">
+      <w:hyperlink w:anchor="_Toc244293915" w:history="1">
         <w:r>
           <w:rPr>
             <w:rStyle w:val="aff9"/>
@@ -1358,7 +1276,7 @@
             <w:webHidden/>
             <w:sz w:val="20"/>
           </w:rPr>
-          <w:instrText>PAGEREF _Toc244112090 \h</w:instrText>
+          <w:instrText>PAGEREF _Toc244293915 \h</w:instrText>
         </w:r>
         <w:r>
           <w:rPr>
@@ -1424,7 +1342,7 @@
           <w14:ligatures w14:val="standardContextual"/>
         </w:rPr>
       </w:pPr>
-      <w:hyperlink w:anchor="_Toc244112091" w:history="1">
+      <w:hyperlink w:anchor="_Toc244293916" w:history="1">
         <w:r>
           <w:rPr>
             <w:rStyle w:val="aff9"/>
@@ -1474,7 +1392,7 @@
             <w:webHidden/>
             <w:sz w:val="20"/>
           </w:rPr>
-          <w:instrText>PAGEREF _Toc244112091 \h</w:instrText>
+          <w:instrText>PAGEREF _Toc244293916 \h</w:instrText>
         </w:r>
         <w:r>
           <w:rPr>
@@ -1540,7 +1458,7 @@
           <w14:ligatures w14:val="standardContextual"/>
         </w:rPr>
       </w:pPr>
-      <w:hyperlink w:anchor="_Toc244112092" w:history="1">
+      <w:hyperlink w:anchor="_Toc244293917" w:history="1">
         <w:r>
           <w:rPr>
             <w:rStyle w:val="aff9"/>
@@ -1590,7 +1508,7 @@
             <w:webHidden/>
             <w:sz w:val="20"/>
           </w:rPr>
-          <w:instrText>PAGEREF _Toc244112092 \h</w:instrText>
+          <w:instrText>PAGEREF _Toc244293917 \h</w:instrText>
         </w:r>
         <w:r>
           <w:rPr>
@@ -1655,7 +1573,7 @@
           <w14:ligatures w14:val="standardContextual"/>
         </w:rPr>
       </w:pPr>
-      <w:hyperlink w:anchor="_Toc244112093" w:history="1">
+      <w:hyperlink w:anchor="_Toc244293918" w:history="1">
         <w:r>
           <w:rPr>
             <w:rStyle w:val="aff9"/>
@@ -1705,7 +1623,7 @@
             <w:webHidden/>
             <w:sz w:val="20"/>
           </w:rPr>
-          <w:instrText>PAGEREF _Toc244112093 \h</w:instrText>
+          <w:instrText>PAGEREF _Toc244293918 \h</w:instrText>
         </w:r>
         <w:r>
           <w:rPr>
@@ -1771,7 +1689,7 @@
           <w14:ligatures w14:val="standardContextual"/>
         </w:rPr>
       </w:pPr>
-      <w:hyperlink w:anchor="_Toc244112094" w:history="1">
+      <w:hyperlink w:anchor="_Toc244293919" w:history="1">
         <w:r>
           <w:rPr>
             <w:rStyle w:val="aff9"/>
@@ -1821,7 +1739,7 @@
             <w:webHidden/>
             <w:sz w:val="20"/>
           </w:rPr>
-          <w:instrText>PAGEREF _Toc244112094 \h</w:instrText>
+          <w:instrText>PAGEREF _Toc244293919 \h</w:instrText>
         </w:r>
         <w:r>
           <w:rPr>
@@ -1887,7 +1805,7 @@
           <w14:ligatures w14:val="standardContextual"/>
         </w:rPr>
       </w:pPr>
-      <w:hyperlink w:anchor="_Toc244112095" w:history="1">
+      <w:hyperlink w:anchor="_Toc244293920" w:history="1">
         <w:r>
           <w:rPr>
             <w:rStyle w:val="aff9"/>
@@ -1937,7 +1855,7 @@
             <w:webHidden/>
             <w:sz w:val="20"/>
           </w:rPr>
-          <w:instrText>PAGEREF _Toc244112095 \h</w:instrText>
+          <w:instrText>PAGEREF _Toc244293920 \h</w:instrText>
         </w:r>
         <w:r>
           <w:rPr>
@@ -2003,7 +1921,7 @@
           <w14:ligatures w14:val="standardContextual"/>
         </w:rPr>
       </w:pPr>
-      <w:hyperlink w:anchor="_Toc244112096" w:history="1">
+      <w:hyperlink w:anchor="_Toc244293921" w:history="1">
         <w:r>
           <w:rPr>
             <w:rStyle w:val="aff9"/>
@@ -2053,7 +1971,7 @@
             <w:webHidden/>
             <w:sz w:val="20"/>
           </w:rPr>
-          <w:instrText>PAGEREF _Toc244112096 \h</w:instrText>
+          <w:instrText>PAGEREF _Toc244293921 \h</w:instrText>
         </w:r>
         <w:r>
           <w:rPr>
@@ -2119,7 +2037,7 @@
           <w14:ligatures w14:val="standardContextual"/>
         </w:rPr>
       </w:pPr>
-      <w:hyperlink w:anchor="_Toc244112097" w:history="1">
+      <w:hyperlink w:anchor="_Toc244293922" w:history="1">
         <w:r>
           <w:rPr>
             <w:rStyle w:val="aff9"/>
@@ -2169,7 +2087,7 @@
             <w:webHidden/>
             <w:sz w:val="20"/>
           </w:rPr>
-          <w:instrText>PAGEREF _Toc244112097 \h</w:instrText>
+          <w:instrText>PAGEREF _Toc244293922 \h</w:instrText>
         </w:r>
         <w:r>
           <w:rPr>
@@ -2235,7 +2153,7 @@
           <w14:ligatures w14:val="standardContextual"/>
         </w:rPr>
       </w:pPr>
-      <w:hyperlink w:anchor="_Toc244112098" w:history="1">
+      <w:hyperlink w:anchor="_Toc244293923" w:history="1">
         <w:r>
           <w:rPr>
             <w:rStyle w:val="aff9"/>
@@ -2293,7 +2211,7 @@
             <w:webHidden/>
             <w:sz w:val="20"/>
           </w:rPr>
-          <w:instrText>PAGEREF _Toc244112098 \h</w:instrText>
+          <w:instrText>PAGEREF _Toc244293923 \h</w:instrText>
         </w:r>
         <w:r>
           <w:rPr>
@@ -2358,7 +2276,7 @@
           <w14:ligatures w14:val="standardContextual"/>
         </w:rPr>
       </w:pPr>
-      <w:hyperlink w:anchor="_Toc244112099" w:history="1">
+      <w:hyperlink w:anchor="_Toc244293924" w:history="1">
         <w:r>
           <w:rPr>
             <w:rStyle w:val="aff9"/>
@@ -2408,7 +2326,7 @@
             <w:webHidden/>
             <w:sz w:val="20"/>
           </w:rPr>
-          <w:instrText>PAGEREF _Toc244112099 \h</w:instrText>
+          <w:instrText>PAGEREF _Toc244293924 \h</w:instrText>
         </w:r>
         <w:r>
           <w:rPr>
@@ -2474,7 +2392,7 @@
           <w14:ligatures w14:val="standardContextual"/>
         </w:rPr>
       </w:pPr>
-      <w:hyperlink w:anchor="_Toc244112100" w:history="1">
+      <w:hyperlink w:anchor="_Toc244293925" w:history="1">
         <w:r>
           <w:rPr>
             <w:rStyle w:val="aff9"/>
@@ -2524,7 +2442,7 @@
             <w:webHidden/>
             <w:sz w:val="20"/>
           </w:rPr>
-          <w:instrText>PAGEREF _Toc244112100 \h</w:instrText>
+          <w:instrText>PAGEREF _Toc244293925 \h</w:instrText>
         </w:r>
         <w:r>
           <w:rPr>
@@ -2590,7 +2508,7 @@
           <w14:ligatures w14:val="standardContextual"/>
         </w:rPr>
       </w:pPr>
-      <w:hyperlink w:anchor="_Toc244112101" w:history="1">
+      <w:hyperlink w:anchor="_Toc244293926" w:history="1">
         <w:r>
           <w:rPr>
             <w:rStyle w:val="aff9"/>
@@ -2640,7 +2558,7 @@
             <w:webHidden/>
             <w:sz w:val="20"/>
           </w:rPr>
-          <w:instrText>PAGEREF _Toc244112101 \h</w:instrText>
+          <w:instrText>PAGEREF _Toc244293926 \h</w:instrText>
         </w:r>
         <w:r>
           <w:rPr>
@@ -2706,7 +2624,7 @@
           <w14:ligatures w14:val="standardContextual"/>
         </w:rPr>
       </w:pPr>
-      <w:hyperlink w:anchor="_Toc244112102" w:history="1">
+      <w:hyperlink w:anchor="_Toc244293927" w:history="1">
         <w:r>
           <w:rPr>
             <w:rStyle w:val="aff9"/>
@@ -2756,7 +2674,7 @@
             <w:webHidden/>
             <w:sz w:val="20"/>
           </w:rPr>
-          <w:instrText>PAGEREF _Toc244112102 \h</w:instrText>
+          <w:instrText>PAGEREF _Toc244293927 \h</w:instrText>
         </w:r>
         <w:r>
           <w:rPr>
@@ -2822,7 +2740,7 @@
           <w14:ligatures w14:val="standardContextual"/>
         </w:rPr>
       </w:pPr>
-      <w:hyperlink w:anchor="_Toc244112103" w:history="1">
+      <w:hyperlink w:anchor="_Toc244293928" w:history="1">
         <w:r>
           <w:rPr>
             <w:rStyle w:val="aff9"/>
@@ -2872,7 +2790,7 @@
             <w:webHidden/>
             <w:sz w:val="20"/>
           </w:rPr>
-          <w:instrText>PAGEREF _Toc244112103 \h</w:instrText>
+          <w:instrText>PAGEREF _Toc244293928 \h</w:instrText>
         </w:r>
         <w:r>
           <w:rPr>
@@ -2937,7 +2855,7 @@
           <w14:ligatures w14:val="standardContextual"/>
         </w:rPr>
       </w:pPr>
-      <w:hyperlink w:anchor="_Toc244112104" w:history="1">
+      <w:hyperlink w:anchor="_Toc244293929" w:history="1">
         <w:r>
           <w:rPr>
             <w:rStyle w:val="aff9"/>
@@ -2987,7 +2905,7 @@
             <w:webHidden/>
             <w:sz w:val="20"/>
           </w:rPr>
-          <w:instrText>PAGEREF _Toc244112104 \h</w:instrText>
+          <w:instrText>PAGEREF _Toc244293929 \h</w:instrText>
         </w:r>
         <w:r>
           <w:rPr>
@@ -3053,7 +2971,7 @@
           <w14:ligatures w14:val="standardContextual"/>
         </w:rPr>
       </w:pPr>
-      <w:hyperlink w:anchor="_Toc244112105" w:history="1">
+      <w:hyperlink w:anchor="_Toc244293930" w:history="1">
         <w:r>
           <w:rPr>
             <w:rStyle w:val="aff9"/>
@@ -3119,7 +3037,7 @@
             <w:webHidden/>
             <w:sz w:val="20"/>
           </w:rPr>
-          <w:instrText>PAGEREF _Toc244112105 \h</w:instrText>
+          <w:instrText>PAGEREF _Toc244293930 \h</w:instrText>
         </w:r>
         <w:r>
           <w:rPr>
@@ -3185,7 +3103,7 @@
           <w14:ligatures w14:val="standardContextual"/>
         </w:rPr>
       </w:pPr>
-      <w:hyperlink w:anchor="_Toc244112106" w:history="1">
+      <w:hyperlink w:anchor="_Toc244293931" w:history="1">
         <w:r>
           <w:rPr>
             <w:rStyle w:val="aff9"/>
@@ -3235,7 +3153,7 @@
             <w:webHidden/>
             <w:sz w:val="20"/>
           </w:rPr>
-          <w:instrText>PAGEREF _Toc244112106 \h</w:instrText>
+          <w:instrText>PAGEREF _Toc244293931 \h</w:instrText>
         </w:r>
         <w:r>
           <w:rPr>
@@ -3301,7 +3219,7 @@
           <w14:ligatures w14:val="standardContextual"/>
         </w:rPr>
       </w:pPr>
-      <w:hyperlink w:anchor="_Toc244112107" w:history="1">
+      <w:hyperlink w:anchor="_Toc244293932" w:history="1">
         <w:r>
           <w:rPr>
             <w:rStyle w:val="aff9"/>
@@ -3351,7 +3269,7 @@
             <w:webHidden/>
             <w:sz w:val="20"/>
           </w:rPr>
-          <w:instrText>PAGEREF _Toc244112107 \h</w:instrText>
+          <w:instrText>PAGEREF _Toc244293932 \h</w:instrText>
         </w:r>
         <w:r>
           <w:rPr>
@@ -3417,7 +3335,7 @@
           <w14:ligatures w14:val="standardContextual"/>
         </w:rPr>
       </w:pPr>
-      <w:hyperlink w:anchor="_Toc244112108" w:history="1">
+      <w:hyperlink w:anchor="_Toc244293933" w:history="1">
         <w:r>
           <w:rPr>
             <w:rStyle w:val="aff9"/>
@@ -3467,7 +3385,7 @@
             <w:webHidden/>
             <w:sz w:val="20"/>
           </w:rPr>
-          <w:instrText>PAGEREF _Toc244112108 \h</w:instrText>
+          <w:instrText>PAGEREF _Toc244293933 \h</w:instrText>
         </w:r>
         <w:r>
           <w:rPr>
@@ -3533,7 +3451,7 @@
           <w14:ligatures w14:val="standardContextual"/>
         </w:rPr>
       </w:pPr>
-      <w:hyperlink w:anchor="_Toc244112109" w:history="1">
+      <w:hyperlink w:anchor="_Toc244293934" w:history="1">
         <w:r>
           <w:rPr>
             <w:rStyle w:val="aff9"/>
@@ -3583,7 +3501,7 @@
             <w:webHidden/>
             <w:sz w:val="20"/>
           </w:rPr>
-          <w:instrText>PAGEREF _Toc244112109 \h</w:instrText>
+          <w:instrText>PAGEREF _Toc244293934 \h</w:instrText>
         </w:r>
         <w:r>
           <w:rPr>
@@ -3648,7 +3566,7 @@
           <w14:ligatures w14:val="standardContextual"/>
         </w:rPr>
       </w:pPr>
-      <w:hyperlink w:anchor="_Toc244112110" w:history="1">
+      <w:hyperlink w:anchor="_Toc244293935" w:history="1">
         <w:r>
           <w:rPr>
             <w:rStyle w:val="aff9"/>
@@ -3698,7 +3616,7 @@
             <w:webHidden/>
             <w:sz w:val="20"/>
           </w:rPr>
-          <w:instrText>PAGEREF _Toc244112110 \h</w:instrText>
+          <w:instrText>PAGEREF _Toc244293935 \h</w:instrText>
         </w:r>
         <w:r>
           <w:rPr>
@@ -3764,7 +3682,7 @@
           <w14:ligatures w14:val="standardContextual"/>
         </w:rPr>
       </w:pPr>
-      <w:hyperlink w:anchor="_Toc244112111" w:history="1">
+      <w:hyperlink w:anchor="_Toc244293936" w:history="1">
         <w:r>
           <w:rPr>
             <w:rStyle w:val="aff9"/>
@@ -3814,7 +3732,7 @@
             <w:webHidden/>
             <w:sz w:val="20"/>
           </w:rPr>
-          <w:instrText>PAGEREF _Toc244112111 \h</w:instrText>
+          <w:instrText>PAGEREF _Toc244293936 \h</w:instrText>
         </w:r>
         <w:r>
           <w:rPr>
@@ -3880,7 +3798,7 @@
           <w14:ligatures w14:val="standardContextual"/>
         </w:rPr>
       </w:pPr>
-      <w:hyperlink w:anchor="_Toc244112112" w:history="1">
+      <w:hyperlink w:anchor="_Toc244293937" w:history="1">
         <w:r>
           <w:rPr>
             <w:rStyle w:val="aff9"/>
@@ -3930,7 +3848,7 @@
             <w:webHidden/>
             <w:sz w:val="20"/>
           </w:rPr>
-          <w:instrText>PAGEREF _Toc244112112 \h</w:instrText>
+          <w:instrText>PAGEREF _Toc244293937 \h</w:instrText>
         </w:r>
         <w:r>
           <w:rPr>
@@ -3995,7 +3913,7 @@
           <w14:ligatures w14:val="standardContextual"/>
         </w:rPr>
       </w:pPr>
-      <w:hyperlink w:anchor="_Toc244112113" w:history="1">
+      <w:hyperlink w:anchor="_Toc244293938" w:history="1">
         <w:r>
           <w:rPr>
             <w:rStyle w:val="aff9"/>
@@ -4045,7 +3963,7 @@
             <w:webHidden/>
             <w:sz w:val="20"/>
           </w:rPr>
-          <w:instrText>PAGEREF _Toc244112113 \h</w:instrText>
+          <w:instrText>PAGEREF _Toc244293938 \h</w:instrText>
         </w:r>
         <w:r>
           <w:rPr>
@@ -4111,7 +4029,7 @@
           <w14:ligatures w14:val="standardContextual"/>
         </w:rPr>
       </w:pPr>
-      <w:hyperlink w:anchor="_Toc244112114" w:history="1">
+      <w:hyperlink w:anchor="_Toc244293939" w:history="1">
         <w:r>
           <w:rPr>
             <w:rStyle w:val="aff9"/>
@@ -4161,7 +4079,7 @@
             <w:webHidden/>
             <w:sz w:val="20"/>
           </w:rPr>
-          <w:instrText>PAGEREF _Toc244112114 \h</w:instrText>
+          <w:instrText>PAGEREF _Toc244293939 \h</w:instrText>
         </w:r>
         <w:r>
           <w:rPr>
@@ -4227,7 +4145,7 @@
           <w14:ligatures w14:val="standardContextual"/>
         </w:rPr>
       </w:pPr>
-      <w:hyperlink w:anchor="_Toc244112115" w:history="1">
+      <w:hyperlink w:anchor="_Toc244293940" w:history="1">
         <w:r>
           <w:rPr>
             <w:rStyle w:val="aff9"/>
@@ -4277,7 +4195,7 @@
             <w:webHidden/>
             <w:sz w:val="20"/>
           </w:rPr>
-          <w:instrText>PAGEREF _Toc244112115 \h</w:instrText>
+          <w:instrText>PAGEREF _Toc244293940 \h</w:instrText>
         </w:r>
         <w:r>
           <w:rPr>
@@ -4343,7 +4261,7 @@
           <w14:ligatures w14:val="standardContextual"/>
         </w:rPr>
       </w:pPr>
-      <w:hyperlink w:anchor="_Toc244112116" w:history="1">
+      <w:hyperlink w:anchor="_Toc244293941" w:history="1">
         <w:r>
           <w:rPr>
             <w:rStyle w:val="aff9"/>
@@ -4393,7 +4311,7 @@
             <w:webHidden/>
             <w:sz w:val="20"/>
           </w:rPr>
-          <w:instrText>PAGEREF _Toc244112116 \h</w:instrText>
+          <w:instrText>PAGEREF _Toc244293941 \h</w:instrText>
         </w:r>
         <w:r>
           <w:rPr>
@@ -4459,7 +4377,7 @@
           <w14:ligatures w14:val="standardContextual"/>
         </w:rPr>
       </w:pPr>
-      <w:hyperlink w:anchor="_Toc244112117" w:history="1">
+      <w:hyperlink w:anchor="_Toc244293942" w:history="1">
         <w:r>
           <w:rPr>
             <w:rStyle w:val="aff9"/>
@@ -4509,7 +4427,7 @@
             <w:webHidden/>
             <w:sz w:val="20"/>
           </w:rPr>
-          <w:instrText>PAGEREF _Toc244112117 \h</w:instrText>
+          <w:instrText>PAGEREF _Toc244293942 \h</w:instrText>
         </w:r>
         <w:r>
           <w:rPr>
@@ -4575,7 +4493,7 @@
           <w14:ligatures w14:val="standardContextual"/>
         </w:rPr>
       </w:pPr>
-      <w:hyperlink w:anchor="_Toc244112118" w:history="1">
+      <w:hyperlink w:anchor="_Toc244293943" w:history="1">
         <w:r>
           <w:rPr>
             <w:rStyle w:val="aff9"/>
@@ -4625,7 +4543,7 @@
             <w:webHidden/>
             <w:sz w:val="20"/>
           </w:rPr>
-          <w:instrText>PAGEREF _Toc244112118 \h</w:instrText>
+          <w:instrText>PAGEREF _Toc244293943 \h</w:instrText>
         </w:r>
         <w:r>
           <w:rPr>
@@ -4691,7 +4609,7 @@
           <w14:ligatures w14:val="standardContextual"/>
         </w:rPr>
       </w:pPr>
-      <w:hyperlink w:anchor="_Toc244112119" w:history="1">
+      <w:hyperlink w:anchor="_Toc244293944" w:history="1">
         <w:r>
           <w:rPr>
             <w:rStyle w:val="aff9"/>
@@ -4741,7 +4659,7 @@
             <w:webHidden/>
             <w:sz w:val="20"/>
           </w:rPr>
-          <w:instrText>PAGEREF _Toc244112119 \h</w:instrText>
+          <w:instrText>PAGEREF _Toc244293944 \h</w:instrText>
         </w:r>
         <w:r>
           <w:rPr>
@@ -4806,7 +4724,7 @@
           <w14:ligatures w14:val="standardContextual"/>
         </w:rPr>
       </w:pPr>
-      <w:hyperlink w:anchor="_Toc244112120" w:history="1">
+      <w:hyperlink w:anchor="_Toc244293945" w:history="1">
         <w:r>
           <w:rPr>
             <w:rStyle w:val="aff9"/>
@@ -4856,7 +4774,7 @@
             <w:webHidden/>
             <w:sz w:val="20"/>
           </w:rPr>
-          <w:instrText>PAGEREF _Toc244112120 \h</w:instrText>
+          <w:instrText>PAGEREF _Toc244293945 \h</w:instrText>
         </w:r>
         <w:r>
           <w:rPr>
@@ -4921,7 +4839,7 @@
           <w14:ligatures w14:val="standardContextual"/>
         </w:rPr>
       </w:pPr>
-      <w:hyperlink w:anchor="_Toc244112121" w:history="1">
+      <w:hyperlink w:anchor="_Toc244293946" w:history="1">
         <w:r>
           <w:rPr>
             <w:rStyle w:val="aff9"/>
@@ -4971,7 +4889,7 @@
             <w:webHidden/>
             <w:sz w:val="20"/>
           </w:rPr>
-          <w:instrText>PAGEREF _Toc244112121 \h</w:instrText>
+          <w:instrText>PAGEREF _Toc244293946 \h</w:instrText>
         </w:r>
         <w:r>
           <w:rPr>
@@ -5036,7 +4954,7 @@
           <w14:ligatures w14:val="standardContextual"/>
         </w:rPr>
       </w:pPr>
-      <w:hyperlink w:anchor="_Toc244112122" w:history="1">
+      <w:hyperlink w:anchor="_Toc244293947" w:history="1">
         <w:r>
           <w:rPr>
             <w:rStyle w:val="aff9"/>
@@ -5086,7 +5004,7 @@
             <w:webHidden/>
             <w:sz w:val="20"/>
           </w:rPr>
-          <w:instrText>PAGEREF _Toc244112122 \h</w:instrText>
+          <w:instrText>PAGEREF _Toc244293947 \h</w:instrText>
         </w:r>
         <w:r>
           <w:rPr>
@@ -5151,7 +5069,7 @@
           <w14:ligatures w14:val="standardContextual"/>
         </w:rPr>
       </w:pPr>
-      <w:hyperlink w:anchor="_Toc244112123" w:history="1">
+      <w:hyperlink w:anchor="_Toc244293948" w:history="1">
         <w:r>
           <w:rPr>
             <w:rStyle w:val="aff9"/>
@@ -5209,7 +5127,7 @@
             <w:webHidden/>
             <w:sz w:val="20"/>
           </w:rPr>
-          <w:instrText>PAGEREF _Toc244112123 \h</w:instrText>
+          <w:instrText>PAGEREF _Toc244293948 \h</w:instrText>
         </w:r>
         <w:r>
           <w:rPr>
@@ -5273,7 +5191,7 @@
       <w:pPr>
         <w:pStyle w:val="1"/>
       </w:pPr>
-      <w:bookmarkStart w:id="1" w:name="_Toc244112087"/>
+      <w:bookmarkStart w:id="1" w:name="_Toc244293912"/>
       <w:r>
         <w:rPr>
           <w:rFonts w:ascii="Times New Roman" w:eastAsia="宋体" w:hAnsi="Times New Roman"/>
@@ -5464,7 +5382,7 @@
       <w:pPr>
         <w:pStyle w:val="1"/>
       </w:pPr>
-      <w:bookmarkStart w:id="2" w:name="_Toc244112088"/>
+      <w:bookmarkStart w:id="2" w:name="_Toc244293913"/>
       <w:r>
         <w:rPr>
           <w:rFonts w:ascii="Times New Roman" w:eastAsia="宋体" w:hAnsi="Times New Roman"/>
@@ -6199,7 +6117,7 @@
       <w:pPr>
         <w:pStyle w:val="1"/>
       </w:pPr>
-      <w:bookmarkStart w:id="3" w:name="_Toc244112089"/>
+      <w:bookmarkStart w:id="3" w:name="_Toc244293914"/>
       <w:r>
         <w:rPr>
           <w:rFonts w:ascii="Times New Roman" w:eastAsia="宋体" w:hAnsi="Times New Roman"/>
@@ -6219,7 +6137,7 @@
       <w:pPr>
         <w:pStyle w:val="21"/>
       </w:pPr>
-      <w:bookmarkStart w:id="4" w:name="_Toc244112090"/>
+      <w:bookmarkStart w:id="4" w:name="_Toc244293915"/>
       <w:r>
         <w:rPr>
           <w:rFonts w:ascii="Times New Roman" w:eastAsia="宋体" w:hAnsi="Times New Roman"/>
@@ -6266,7 +6184,7 @@
           <w:noProof/>
         </w:rPr>
         <w:drawing>
-          <wp:inline distT="0" distB="0" distL="0" distR="0" wp14:anchorId="08AAD4D0" wp14:editId="1CB2E1FE">
+          <wp:inline distT="0" distB="0" distL="0" distR="0" wp14:anchorId="3B7A34EE" wp14:editId="5A4D52A5">
             <wp:extent cx="5669280" cy="4999274"/>
             <wp:effectExtent l="0" t="0" r="0" b="0"/>
             <wp:docPr id="1" name="Picture 1"/>
@@ -6348,7 +6266,7 @@
       <w:pPr>
         <w:pStyle w:val="21"/>
       </w:pPr>
-      <w:bookmarkStart w:id="5" w:name="_Toc244112091"/>
+      <w:bookmarkStart w:id="5" w:name="_Toc244293916"/>
       <w:r>
         <w:rPr>
           <w:rFonts w:ascii="Times New Roman" w:eastAsia="宋体" w:hAnsi="Times New Roman"/>
@@ -6992,7 +6910,7 @@
       <w:pPr>
         <w:pStyle w:val="21"/>
       </w:pPr>
-      <w:bookmarkStart w:id="6" w:name="_Toc244112092"/>
+      <w:bookmarkStart w:id="6" w:name="_Toc244293917"/>
       <w:r>
         <w:rPr>
           <w:rFonts w:ascii="Times New Roman" w:eastAsia="宋体" w:hAnsi="Times New Roman"/>
@@ -7106,7 +7024,7 @@
       <w:pPr>
         <w:pStyle w:val="1"/>
       </w:pPr>
-      <w:bookmarkStart w:id="7" w:name="_Toc244112093"/>
+      <w:bookmarkStart w:id="7" w:name="_Toc244293918"/>
       <w:r>
         <w:rPr>
           <w:rFonts w:ascii="Times New Roman" w:eastAsia="宋体" w:hAnsi="Times New Roman"/>
@@ -7125,7 +7043,7 @@
       <w:pPr>
         <w:pStyle w:val="21"/>
       </w:pPr>
-      <w:bookmarkStart w:id="8" w:name="_Toc244112094"/>
+      <w:bookmarkStart w:id="8" w:name="_Toc244293919"/>
       <w:r>
         <w:rPr>
           <w:rFonts w:ascii="Times New Roman" w:eastAsia="宋体" w:hAnsi="Times New Roman"/>
@@ -8082,7 +8000,7 @@
       <w:pPr>
         <w:pStyle w:val="21"/>
       </w:pPr>
-      <w:bookmarkStart w:id="9" w:name="_Toc244112095"/>
+      <w:bookmarkStart w:id="9" w:name="_Toc244293920"/>
       <w:r>
         <w:rPr>
           <w:rFonts w:ascii="Times New Roman" w:eastAsia="宋体" w:hAnsi="Times New Roman"/>
@@ -8389,7 +8307,7 @@
       <w:pPr>
         <w:pStyle w:val="21"/>
       </w:pPr>
-      <w:bookmarkStart w:id="10" w:name="_Toc244112096"/>
+      <w:bookmarkStart w:id="10" w:name="_Toc244293921"/>
       <w:r>
         <w:rPr>
           <w:rFonts w:ascii="Times New Roman" w:eastAsia="宋体" w:hAnsi="Times New Roman"/>
@@ -10002,7 +9920,7 @@
       <w:pPr>
         <w:pStyle w:val="21"/>
       </w:pPr>
-      <w:bookmarkStart w:id="11" w:name="_Toc244112097"/>
+      <w:bookmarkStart w:id="11" w:name="_Toc244293922"/>
       <w:r>
         <w:rPr>
           <w:rFonts w:ascii="Times New Roman" w:eastAsia="宋体" w:hAnsi="Times New Roman"/>
@@ -10422,7 +10340,7 @@
           <w:noProof/>
         </w:rPr>
         <w:drawing>
-          <wp:inline distT="0" distB="0" distL="0" distR="0" wp14:anchorId="15948A1E" wp14:editId="7E836741">
+          <wp:inline distT="0" distB="0" distL="0" distR="0" wp14:anchorId="63686905" wp14:editId="3791BFEE">
             <wp:extent cx="5669280" cy="5980482"/>
             <wp:effectExtent l="0" t="0" r="0" b="0"/>
             <wp:docPr id="2" name="Picture 2"/>
@@ -10637,7 +10555,7 @@
       <w:pPr>
         <w:pStyle w:val="21"/>
       </w:pPr>
-      <w:bookmarkStart w:id="12" w:name="_Toc244112098"/>
+      <w:bookmarkStart w:id="12" w:name="_Toc244293923"/>
       <w:r>
         <w:rPr>
           <w:rFonts w:ascii="Times New Roman" w:eastAsia="宋体" w:hAnsi="Times New Roman"/>
@@ -10760,7 +10678,7 @@
       <w:pPr>
         <w:pStyle w:val="1"/>
       </w:pPr>
-      <w:bookmarkStart w:id="13" w:name="_Toc244112099"/>
+      <w:bookmarkStart w:id="13" w:name="_Toc244293924"/>
       <w:r>
         <w:rPr>
           <w:rFonts w:ascii="Times New Roman" w:eastAsia="宋体" w:hAnsi="Times New Roman"/>
@@ -10779,7 +10697,7 @@
       <w:pPr>
         <w:pStyle w:val="21"/>
       </w:pPr>
-      <w:bookmarkStart w:id="14" w:name="_Toc244112100"/>
+      <w:bookmarkStart w:id="14" w:name="_Toc244293925"/>
       <w:r>
         <w:rPr>
           <w:rFonts w:ascii="Times New Roman" w:eastAsia="宋体" w:hAnsi="Times New Roman"/>
@@ -10970,7 +10888,7 @@
         </w:rPr>
         <w:lastRenderedPageBreak/>
         <w:drawing>
-          <wp:inline distT="0" distB="0" distL="0" distR="0" wp14:anchorId="121D17F6" wp14:editId="012CE8DA">
+          <wp:inline distT="0" distB="0" distL="0" distR="0" wp14:anchorId="6D7CE281" wp14:editId="6B0A4EEB">
             <wp:extent cx="4389120" cy="6102967"/>
             <wp:effectExtent l="0" t="0" r="0" b="0"/>
             <wp:docPr id="3" name="Picture 3"/>
@@ -11037,7 +10955,7 @@
       <w:pPr>
         <w:pStyle w:val="21"/>
       </w:pPr>
-      <w:bookmarkStart w:id="15" w:name="_Toc244112101"/>
+      <w:bookmarkStart w:id="15" w:name="_Toc244293926"/>
       <w:r>
         <w:rPr>
           <w:rFonts w:ascii="Times New Roman" w:eastAsia="宋体" w:hAnsi="Times New Roman"/>
@@ -11200,7 +11118,7 @@
         </w:rPr>
         <w:lastRenderedPageBreak/>
         <w:drawing>
-          <wp:inline distT="0" distB="0" distL="0" distR="0" wp14:anchorId="32ED9451" wp14:editId="5F5FA5D7">
+          <wp:inline distT="0" distB="0" distL="0" distR="0" wp14:anchorId="0582887B" wp14:editId="7BBA9AF1">
             <wp:extent cx="5394960" cy="6367053"/>
             <wp:effectExtent l="0" t="0" r="0" b="0"/>
             <wp:docPr id="4" name="Picture 4"/>
@@ -11267,7 +11185,7 @@
       <w:pPr>
         <w:pStyle w:val="21"/>
       </w:pPr>
-      <w:bookmarkStart w:id="16" w:name="_Toc244112102"/>
+      <w:bookmarkStart w:id="16" w:name="_Toc244293927"/>
       <w:r>
         <w:rPr>
           <w:rFonts w:ascii="Times New Roman" w:eastAsia="宋体" w:hAnsi="Times New Roman"/>
@@ -11448,7 +11366,7 @@
         </w:rPr>
         <w:lastRenderedPageBreak/>
         <w:drawing>
-          <wp:inline distT="0" distB="0" distL="0" distR="0" wp14:anchorId="736A1A35" wp14:editId="487C5765">
+          <wp:inline distT="0" distB="0" distL="0" distR="0" wp14:anchorId="40D6FB99" wp14:editId="127EF3BA">
             <wp:extent cx="4572000" cy="6542636"/>
             <wp:effectExtent l="0" t="0" r="0" b="0"/>
             <wp:docPr id="5" name="Picture 5"/>
@@ -11515,7 +11433,7 @@
       <w:pPr>
         <w:pStyle w:val="21"/>
       </w:pPr>
-      <w:bookmarkStart w:id="17" w:name="_Toc244112103"/>
+      <w:bookmarkStart w:id="17" w:name="_Toc244293928"/>
       <w:r>
         <w:rPr>
           <w:rFonts w:ascii="Times New Roman" w:eastAsia="宋体" w:hAnsi="Times New Roman"/>
@@ -11609,7 +11527,7 @@
         </w:rPr>
         <w:lastRenderedPageBreak/>
         <w:drawing>
-          <wp:inline distT="0" distB="0" distL="0" distR="0" wp14:anchorId="65318625" wp14:editId="37F42C15">
+          <wp:inline distT="0" distB="0" distL="0" distR="0" wp14:anchorId="2B58E390" wp14:editId="0C1EDF9C">
             <wp:extent cx="3794760" cy="7086090"/>
             <wp:effectExtent l="0" t="0" r="0" b="0"/>
             <wp:docPr id="6" name="Picture 6"/>
@@ -11676,7 +11594,7 @@
       <w:pPr>
         <w:pStyle w:val="1"/>
       </w:pPr>
-      <w:bookmarkStart w:id="18" w:name="_Toc244112104"/>
+      <w:bookmarkStart w:id="18" w:name="_Toc244293929"/>
       <w:r>
         <w:rPr>
           <w:rFonts w:ascii="Times New Roman" w:eastAsia="宋体" w:hAnsi="Times New Roman"/>
@@ -11695,7 +11613,7 @@
       <w:pPr>
         <w:pStyle w:val="21"/>
       </w:pPr>
-      <w:bookmarkStart w:id="19" w:name="_Toc244112105"/>
+      <w:bookmarkStart w:id="19" w:name="_Toc244293930"/>
       <w:r>
         <w:rPr>
           <w:rFonts w:ascii="Times New Roman" w:eastAsia="宋体" w:hAnsi="Times New Roman"/>
@@ -12388,7 +12306,7 @@
       <w:pPr>
         <w:pStyle w:val="21"/>
       </w:pPr>
-      <w:bookmarkStart w:id="20" w:name="_Toc244112106"/>
+      <w:bookmarkStart w:id="20" w:name="_Toc244293931"/>
       <w:r>
         <w:rPr>
           <w:rFonts w:ascii="Times New Roman" w:eastAsia="宋体" w:hAnsi="Times New Roman"/>
@@ -12634,7 +12552,7 @@
       <w:pPr>
         <w:pStyle w:val="21"/>
       </w:pPr>
-      <w:bookmarkStart w:id="21" w:name="_Toc244112107"/>
+      <w:bookmarkStart w:id="21" w:name="_Toc244293932"/>
       <w:r>
         <w:rPr>
           <w:rFonts w:ascii="Times New Roman" w:eastAsia="宋体" w:hAnsi="Times New Roman"/>
@@ -12896,7 +12814,7 @@
       <w:pPr>
         <w:pStyle w:val="21"/>
       </w:pPr>
-      <w:bookmarkStart w:id="22" w:name="_Toc244112108"/>
+      <w:bookmarkStart w:id="22" w:name="_Toc244293933"/>
       <w:r>
         <w:rPr>
           <w:rFonts w:ascii="Times New Roman" w:eastAsia="宋体" w:hAnsi="Times New Roman"/>
@@ -12996,7 +12914,7 @@
       <w:pPr>
         <w:pStyle w:val="21"/>
       </w:pPr>
-      <w:bookmarkStart w:id="23" w:name="_Toc244112109"/>
+      <w:bookmarkStart w:id="23" w:name="_Toc244293934"/>
       <w:r>
         <w:rPr>
           <w:rFonts w:ascii="Times New Roman" w:eastAsia="宋体" w:hAnsi="Times New Roman"/>
@@ -13163,7 +13081,7 @@
       <w:pPr>
         <w:pStyle w:val="1"/>
       </w:pPr>
-      <w:bookmarkStart w:id="24" w:name="_Toc244112110"/>
+      <w:bookmarkStart w:id="24" w:name="_Toc244293935"/>
       <w:r>
         <w:rPr>
           <w:rFonts w:ascii="Times New Roman" w:eastAsia="宋体" w:hAnsi="Times New Roman"/>
@@ -13182,7 +13100,7 @@
       <w:pPr>
         <w:pStyle w:val="21"/>
       </w:pPr>
-      <w:bookmarkStart w:id="25" w:name="_Toc244112111"/>
+      <w:bookmarkStart w:id="25" w:name="_Toc244293936"/>
       <w:r>
         <w:rPr>
           <w:rFonts w:ascii="Times New Roman" w:eastAsia="宋体" w:hAnsi="Times New Roman"/>
@@ -13327,7 +13245,7 @@
       <w:pPr>
         <w:pStyle w:val="21"/>
       </w:pPr>
-      <w:bookmarkStart w:id="26" w:name="_Toc244112112"/>
+      <w:bookmarkStart w:id="26" w:name="_Toc244293937"/>
       <w:r>
         <w:rPr>
           <w:rFonts w:ascii="Times New Roman" w:eastAsia="宋体" w:hAnsi="Times New Roman"/>
@@ -13603,7 +13521,7 @@
       <w:pPr>
         <w:pStyle w:val="1"/>
       </w:pPr>
-      <w:bookmarkStart w:id="27" w:name="_Toc244112113"/>
+      <w:bookmarkStart w:id="27" w:name="_Toc244293938"/>
       <w:r>
         <w:rPr>
           <w:rFonts w:ascii="Times New Roman" w:eastAsia="宋体" w:hAnsi="Times New Roman"/>
@@ -13622,7 +13540,7 @@
       <w:pPr>
         <w:pStyle w:val="21"/>
       </w:pPr>
-      <w:bookmarkStart w:id="28" w:name="_Toc244112114"/>
+      <w:bookmarkStart w:id="28" w:name="_Toc244293939"/>
       <w:r>
         <w:rPr>
           <w:rFonts w:ascii="Times New Roman" w:eastAsia="宋体" w:hAnsi="Times New Roman"/>
@@ -13856,7 +13774,7 @@
       <w:pPr>
         <w:pStyle w:val="21"/>
       </w:pPr>
-      <w:bookmarkStart w:id="29" w:name="_Toc244112115"/>
+      <w:bookmarkStart w:id="29" w:name="_Toc244293940"/>
       <w:r>
         <w:rPr>
           <w:rFonts w:ascii="Times New Roman" w:eastAsia="宋体" w:hAnsi="Times New Roman"/>
@@ -14010,7 +13928,7 @@
       <w:pPr>
         <w:pStyle w:val="21"/>
       </w:pPr>
-      <w:bookmarkStart w:id="30" w:name="_Toc244112116"/>
+      <w:bookmarkStart w:id="30" w:name="_Toc244293941"/>
       <w:r>
         <w:rPr>
           <w:rFonts w:ascii="Times New Roman" w:eastAsia="宋体" w:hAnsi="Times New Roman"/>
@@ -15467,7 +15385,7 @@
       <w:pPr>
         <w:pStyle w:val="21"/>
       </w:pPr>
-      <w:bookmarkStart w:id="31" w:name="_Toc244112117"/>
+      <w:bookmarkStart w:id="31" w:name="_Toc244293942"/>
       <w:r>
         <w:rPr>
           <w:rFonts w:ascii="Times New Roman" w:eastAsia="宋体" w:hAnsi="Times New Roman"/>
@@ -15920,7 +15838,7 @@
       <w:pPr>
         <w:pStyle w:val="21"/>
       </w:pPr>
-      <w:bookmarkStart w:id="32" w:name="_Toc244112118"/>
+      <w:bookmarkStart w:id="32" w:name="_Toc244293943"/>
       <w:r>
         <w:rPr>
           <w:rFonts w:ascii="Times New Roman" w:eastAsia="宋体" w:hAnsi="Times New Roman"/>
@@ -16835,7 +16753,7 @@
       <w:pPr>
         <w:pStyle w:val="21"/>
       </w:pPr>
-      <w:bookmarkStart w:id="33" w:name="_Toc244112119"/>
+      <w:bookmarkStart w:id="33" w:name="_Toc244293944"/>
       <w:r>
         <w:rPr>
           <w:rFonts w:ascii="Times New Roman" w:eastAsia="宋体" w:hAnsi="Times New Roman"/>
@@ -17666,7 +17584,7 @@
       <w:pPr>
         <w:pStyle w:val="1"/>
       </w:pPr>
-      <w:bookmarkStart w:id="34" w:name="_Toc244112120"/>
+      <w:bookmarkStart w:id="34" w:name="_Toc244293945"/>
       <w:r>
         <w:rPr>
           <w:rFonts w:ascii="Times New Roman" w:eastAsia="宋体" w:hAnsi="Times New Roman"/>
@@ -18755,7 +18673,7 @@
       <w:pPr>
         <w:pStyle w:val="1"/>
       </w:pPr>
-      <w:bookmarkStart w:id="35" w:name="_Toc244112121"/>
+      <w:bookmarkStart w:id="35" w:name="_Toc244293946"/>
       <w:r>
         <w:rPr>
           <w:rFonts w:ascii="Times New Roman" w:eastAsia="宋体" w:hAnsi="Times New Roman"/>
@@ -18929,7 +18847,7 @@
       <w:pPr>
         <w:pStyle w:val="1"/>
       </w:pPr>
-      <w:bookmarkStart w:id="36" w:name="_Toc244112122"/>
+      <w:bookmarkStart w:id="36" w:name="_Toc244293947"/>
       <w:r>
         <w:rPr>
           <w:rFonts w:ascii="Times New Roman" w:eastAsia="宋体" w:hAnsi="Times New Roman"/>
@@ -19027,7 +18945,7 @@
       <w:pPr>
         <w:pStyle w:val="1"/>
       </w:pPr>
-      <w:bookmarkStart w:id="37" w:name="_Toc244112123"/>
+      <w:bookmarkStart w:id="37" w:name="_Toc244293948"/>
       <w:r>
         <w:rPr>
           <w:rFonts w:ascii="Times New Roman" w:eastAsia="宋体" w:hAnsi="Times New Roman"/>
@@ -19656,31 +19574,31 @@
       </w:rPr>
     </w:lvl>
   </w:abstractNum>
-  <w:num w:numId="1" w16cid:durableId="630475666">
+  <w:num w:numId="1" w16cid:durableId="1047991936">
     <w:abstractNumId w:val="8"/>
   </w:num>
-  <w:num w:numId="2" w16cid:durableId="553271601">
+  <w:num w:numId="2" w16cid:durableId="408814498">
     <w:abstractNumId w:val="6"/>
   </w:num>
-  <w:num w:numId="3" w16cid:durableId="992174027">
+  <w:num w:numId="3" w16cid:durableId="1325089052">
     <w:abstractNumId w:val="5"/>
   </w:num>
-  <w:num w:numId="4" w16cid:durableId="1180854672">
+  <w:num w:numId="4" w16cid:durableId="52504754">
     <w:abstractNumId w:val="4"/>
   </w:num>
-  <w:num w:numId="5" w16cid:durableId="1836995712">
+  <w:num w:numId="5" w16cid:durableId="1510950540">
     <w:abstractNumId w:val="7"/>
   </w:num>
-  <w:num w:numId="6" w16cid:durableId="1186670980">
+  <w:num w:numId="6" w16cid:durableId="1508327142">
     <w:abstractNumId w:val="3"/>
   </w:num>
-  <w:num w:numId="7" w16cid:durableId="275527219">
+  <w:num w:numId="7" w16cid:durableId="154688306">
     <w:abstractNumId w:val="2"/>
   </w:num>
-  <w:num w:numId="8" w16cid:durableId="413012618">
+  <w:num w:numId="8" w16cid:durableId="2118863621">
     <w:abstractNumId w:val="1"/>
   </w:num>
-  <w:num w:numId="9" w16cid:durableId="898445081">
+  <w:num w:numId="9" w16cid:durableId="2002149292">
     <w:abstractNumId w:val="0"/>
   </w:num>
 </w:numbering>
@@ -31106,7 +31024,7 @@
     <w:autoRedefine/>
     <w:uiPriority w:val="39"/>
     <w:unhideWhenUsed/>
-    <w:rsid w:val="00153CA5"/>
+    <w:rsid w:val="00C064E6"/>
   </w:style>
   <w:style w:type="paragraph" w:styleId="TOC2">
     <w:name w:val="toc 2"/>
@@ -31115,7 +31033,7 @@
     <w:autoRedefine/>
     <w:uiPriority w:val="39"/>
     <w:unhideWhenUsed/>
-    <w:rsid w:val="00153CA5"/>
+    <w:rsid w:val="00C064E6"/>
     <w:pPr>
       <w:ind w:leftChars="200" w:left="420"/>
     </w:pPr>
@@ -31125,7 +31043,7 @@
     <w:basedOn w:val="a2"/>
     <w:uiPriority w:val="99"/>
     <w:unhideWhenUsed/>
-    <w:rsid w:val="00153CA5"/>
+    <w:rsid w:val="00C064E6"/>
     <w:rPr>
       <w:color w:val="0000FF" w:themeColor="hyperlink"/>
       <w:u w:val="single"/>

</xml_diff>